<commit_message>
Update ENGL 1102-01 Unit 2 assignment: replace Scribbr with fifth topic-specific source (Frostholm, 2023) among the five literature sources
</commit_message>
<xml_diff>
--- a/Term_02/ENGL 1102-01 English Composition 2 - AY2027-T1/Assignments/Unit2_Assignment.docx
+++ b/Term_02/ENGL 1102-01 English Composition 2 - AY2027-T1/Assignments/Unit2_Assignment.docx
@@ -176,7 +176,7 @@
           <w:b w:val="0"/>
           <w:sz w:val="24"/>
         </w:rPr>
-        <w:t>That falsifiable core is also what makes the SMART pieces line up. Naming both training routes plus a fixed window covers specificity, and it's achievable since kitchens and culinary schools already track outcomes like these. Relevance follows from how often the debate comes up among people entering the industry, and holding both groups to the same window is what keeps it time-bound and fair, rather than letting extra years on the job tip the scale for either side.</w:t>
+        <w:t>That falsifiable core is also what makes the SMART pieces line up. Naming both training routes plus a fixed window covers specificity, and it's achievable since kitchens and culinary schools already track outcomes like these. Relevance follows from how often the debate comes up among people entering the industry, and holding both groups to the same window is what keeps it time-bound and fair, rather than letting extra years of workplace exposure tip the scale for either side.</w:t>
       </w:r>
     </w:p>
     <w:p>
@@ -220,7 +220,7 @@
           <w:i w:val="0"/>
           <w:sz w:val="24"/>
         </w:rPr>
-        <w:t>, comes from Rutgers University Press and is based on her own doctoral research into how restaurant workers actually rise through the ranks. Its credibility rests on being formally reviewed academic sociology, not just industry opinion, and her central idea, that success depends on “kitchen capital” built through real workplace experience, speaks directly to the on-the-job side of this hypothesis.</w:t>
+        <w:t>, comes from Rutgers University Press and is based on her own doctoral research into how restaurant workers actually rise through the ranks. Its credibility rests on being formally reviewed academic sociology, not just industry opinion, and her central idea, that success depends on “kitchen capital” built through real workplace experience, speaks directly to what the hypothesis predicts about learning on the job.</w:t>
       </w:r>
     </w:p>
     <w:p>
@@ -321,10 +321,26 @@
       <w:r>
         <w:rPr>
           <w:rFonts w:ascii="Times New Roman" w:hAnsi="Times New Roman"/>
-          <w:b w:val="0"/>
+          <w:i w:val="0"/>
           <w:sz w:val="24"/>
         </w:rPr>
-        <w:t>The fifth entry works differently. George's (2024) Scribbr article on spotting reliable research isn't culinary literature; it's the yardstick everything else got measured against before making the cut. Authorship, review status, and currency are what it says to check, and running the four studies above through that checklist kept this list honest.</w:t>
+        <w:t xml:space="preserve">Last on the list, Frostholm (2023) appears in </w:t>
+      </w:r>
+      <w:r>
+        <w:rPr>
+          <w:rFonts w:ascii="Times New Roman" w:hAnsi="Times New Roman"/>
+          <w:i/>
+          <w:sz w:val="24"/>
+        </w:rPr>
+        <w:t>Education in the North</w:t>
+      </w:r>
+      <w:r>
+        <w:rPr>
+          <w:rFonts w:ascii="Times New Roman" w:hAnsi="Times New Roman"/>
+          <w:i w:val="0"/>
+          <w:sz w:val="24"/>
+        </w:rPr>
+        <w:t>, a peer-reviewed, open-access journal from the University of Aberdeen's School of Education. The article looks specifically at apprentice chefs learning craftsmanship and workplace social practices inside a real professional kitchen, making it the closest match here for what the on-the-job group is predicted to gain, and a useful counterweight to sources that only study culinary-school settings.</w:t>
       </w:r>
     </w:p>
     <w:p>
@@ -352,7 +368,7 @@
           <w:b w:val="0"/>
           <w:sz w:val="24"/>
         </w:rPr>
-        <w:t>Each of these five earned its spot for a specific reason, not just for mentioning chefs or kitchens. Meiser's fieldwork and Tsui and Chen's training comparison back the hands-on half of what this hypothesis predicts; Hu et al. complicate any easy story about which path teaches more; Na, Jung, and Han's survey keeps that whole prediction honest by showing education-job match isn't automatically decisive; and Scribbr supplied the actual criteria used to decide whether any of the four belonged here at all. Put side by side, this research suggests the relationship between formal training and real kitchen skill isn't nearly as settled as either side of the debate likes to claim.</w:t>
+        <w:t>Each of these five earned its spot for a specific reason, not just for mentioning chefs or kitchens. Meiser's fieldwork, Tsui and Chen's training comparison, and Frostholm's look at apprentice chefs all support the workplace-training prediction; Hu et al. complicate any easy story about which path teaches more; and Na, Jung, and Han's survey keeps that whole prediction honest by showing education-job match isn't automatically decisive. Each source was checked against George's (2024) standard for authorship, review status, and currency before making this list. Put side by side, this research suggests the relationship between formal training and real kitchen skill isn't nearly as settled as either side of the debate likes to claim.</w:t>
       </w:r>
     </w:p>
     <w:p>
@@ -385,6 +401,63 @@
           <w:i w:val="0"/>
           <w:sz w:val="24"/>
         </w:rPr>
+        <w:t xml:space="preserve">Frostholm, P. H. (2023). The practical craftmanship and social practices of apprentice chefs in a professional kitchen setting. </w:t>
+      </w:r>
+      <w:r>
+        <w:rPr>
+          <w:rFonts w:ascii="Times New Roman" w:hAnsi="Times New Roman"/>
+          <w:i/>
+          <w:sz w:val="24"/>
+        </w:rPr>
+        <w:t>Education in the North</w:t>
+      </w:r>
+      <w:r>
+        <w:rPr>
+          <w:rFonts w:ascii="Times New Roman" w:hAnsi="Times New Roman"/>
+          <w:i w:val="0"/>
+          <w:sz w:val="24"/>
+        </w:rPr>
+        <w:t xml:space="preserve">, </w:t>
+      </w:r>
+      <w:r>
+        <w:rPr>
+          <w:rFonts w:ascii="Times New Roman" w:hAnsi="Times New Roman"/>
+          <w:i/>
+          <w:sz w:val="24"/>
+        </w:rPr>
+        <w:t>30</w:t>
+      </w:r>
+      <w:r>
+        <w:rPr>
+          <w:rFonts w:ascii="Times New Roman" w:hAnsi="Times New Roman"/>
+          <w:i w:val="0"/>
+          <w:sz w:val="24"/>
+        </w:rPr>
+        <w:t xml:space="preserve">(1), 3–18. </w:t>
+      </w:r>
+      <w:hyperlink r:id="rId9">
+        <w:r>
+          <w:rPr>
+            <w:rFonts w:ascii="Times New Roman" w:hAnsi="Times New Roman"/>
+            <w:sz w:val="24"/>
+            <w:color w:val="0563C1"/>
+            <w:u w:val="single"/>
+          </w:rPr>
+          <w:t>https://www.abdn.ac.uk/uploads/education/documents/journals_documents/Volume_30_Issue_1_Engine_Room/2_EITN_2023_01_02_Frostholm.pdf</w:t>
+        </w:r>
+      </w:hyperlink>
+    </w:p>
+    <w:p>
+      <w:pPr>
+        <w:spacing w:line="480" w:lineRule="auto" w:after="0"/>
+        <w:ind w:left="720" w:hanging="720"/>
+      </w:pPr>
+      <w:r>
+        <w:rPr>
+          <w:rFonts w:ascii="Times New Roman" w:hAnsi="Times New Roman"/>
+          <w:i w:val="0"/>
+          <w:sz w:val="24"/>
+        </w:rPr>
         <w:t xml:space="preserve">George, T. (2024, May 9). </w:t>
       </w:r>
       <w:r>
@@ -403,7 +476,7 @@
         </w:rPr>
         <w:t xml:space="preserve">. Scribbr. </w:t>
       </w:r>
-      <w:hyperlink r:id="rId9">
+      <w:hyperlink r:id="rId10">
         <w:r>
           <w:rPr>
             <w:rFonts w:ascii="Times New Roman" w:hAnsi="Times New Roman"/>
@@ -460,7 +533,7 @@
         </w:rPr>
         <w:t xml:space="preserve">(2), 83–97. </w:t>
       </w:r>
-      <w:hyperlink r:id="rId10">
+      <w:hyperlink r:id="rId11">
         <w:r>
           <w:rPr>
             <w:rFonts w:ascii="Times New Roman" w:hAnsi="Times New Roman"/>
@@ -501,7 +574,7 @@
         </w:rPr>
         <w:t xml:space="preserve">. Rutgers University Press. </w:t>
       </w:r>
-      <w:hyperlink r:id="rId11">
+      <w:hyperlink r:id="rId12">
         <w:r>
           <w:rPr>
             <w:rFonts w:ascii="Times New Roman" w:hAnsi="Times New Roman"/>
@@ -558,7 +631,7 @@
         </w:rPr>
         <w:t xml:space="preserve">(4), 874–886. </w:t>
       </w:r>
-      <w:hyperlink r:id="rId12">
+      <w:hyperlink r:id="rId13">
         <w:r>
           <w:rPr>
             <w:rFonts w:ascii="Times New Roman" w:hAnsi="Times New Roman"/>
@@ -599,7 +672,7 @@
         </w:rPr>
         <w:t xml:space="preserve"> (5th ed.). GALILEO Open Learning Materials. </w:t>
       </w:r>
-      <w:hyperlink r:id="rId13">
+      <w:hyperlink r:id="rId14">
         <w:r>
           <w:rPr>
             <w:rFonts w:ascii="Times New Roman" w:hAnsi="Times New Roman"/>
@@ -656,7 +729,7 @@
         </w:rPr>
         <w:t xml:space="preserve">(5), 1951. </w:t>
       </w:r>
-      <w:hyperlink r:id="rId14">
+      <w:hyperlink r:id="rId15">
         <w:r>
           <w:rPr>
             <w:rFonts w:ascii="Times New Roman" w:hAnsi="Times New Roman"/>

</xml_diff>